<commit_message>
fixed use case scenario numberingin module 4 scenario document
</commit_message>
<xml_diff>
--- a/Diagrams/module_4_asset/4.UseCaseScenario_AssignAsset.docx
+++ b/Diagrams/module_4_asset/4.UseCaseScenario_AssignAsset.docx
@@ -163,13 +163,21 @@
             <w:pPr>
               <w:rPr>
                 <w:rFonts w:asciiTheme="majorHAnsi" w:hAnsiTheme="majorHAnsi"/>
+                <w:lang w:val="en-US"/>
               </w:rPr>
             </w:pPr>
             <w:r>
               <w:rPr>
                 <w:rFonts w:asciiTheme="majorHAnsi" w:hAnsiTheme="majorHAnsi"/>
               </w:rPr>
-              <w:t>UC-01</w:t>
+              <w:t>UC-0</w:t>
+            </w:r>
+            <w:r>
+              <w:rPr>
+                <w:rFonts w:asciiTheme="majorHAnsi" w:hAnsiTheme="majorHAnsi"/>
+                <w:lang w:val="en-US"/>
+              </w:rPr>
+              <w:t>4</w:t>
             </w:r>
           </w:p>
         </w:tc>
@@ -711,7 +719,7 @@
     <w:rPrDefault>
       <w:rPr>
         <w:rFonts w:ascii="Times New Roman" w:eastAsia="Times New Roman" w:hAnsi="Times New Roman" w:cs="Times New Roman"/>
-        <w:lang w:val="en-LK" w:eastAsia="en-GB" w:bidi="si-LK"/>
+        <w:lang w:eastAsia="en-GB" w:bidi="si-LK"/>
       </w:rPr>
     </w:rPrDefault>
     <w:pPrDefault/>

</xml_diff>